<commit_message>
Update final report PDF and Word template with latest changes
</commit_message>
<xml_diff>
--- a/Final_Project_Report_Template.docx
+++ b/Final_Project_Report_Template.docx
@@ -4728,13 +4728,6 @@
       <w:pStyle w:val="Footer"/>
       <w:jc w:val="center"/>
     </w:pPr>
-    <w:r>
-      <w:rPr>
-        <w:color w:val="646464"/>
-        <w:sz w:val="18"/>
-      </w:rPr>
-      <w:t>Dummy project report template | Replace all bracketed text with your own content</w:t>
-    </w:r>
   </w:p>
 </w:ftr>
 </file>
@@ -4772,7 +4765,7 @@
       <w:jc w:val="right"/>
     </w:pPr>
     <w:r>
-      <w:t>Project Report Template — Pandas, NumPy, and Matplotlib</w:t>
+      <w:t>Project Report— Pandas, NumPy, and Matplotlib</w:t>
     </w:r>
   </w:p>
 </w:hdr>

</xml_diff>